<commit_message>
Code and tests improvements
</commit_message>
<xml_diff>
--- a/Test/README Test.docx
+++ b/Test/README Test.docx
@@ -7,12 +7,39 @@
         <w:pStyle w:val="Titre1"/>
       </w:pPr>
       <w:r>
-        <w:t>Principe du test</w:t>
+        <w:t>Principe d</w:t>
+      </w:r>
+      <w:r>
+        <w:t>es</w:t>
+      </w:r>
+      <w:r>
+        <w:t xml:space="preserve"> test</w:t>
+      </w:r>
+      <w:r>
+        <w:t>s</w:t>
       </w:r>
     </w:p>
     <w:p>
       <w:r>
-        <w:t>Ce test donne un exemple complet d’un</w:t>
+        <w:t xml:space="preserve">Ce </w:t>
+      </w:r>
+      <w:r>
+        <w:t xml:space="preserve">dossier fournit 2 </w:t>
+      </w:r>
+      <w:r>
+        <w:t>exemple</w:t>
+      </w:r>
+      <w:r>
+        <w:t xml:space="preserve">s </w:t>
+      </w:r>
+      <w:r>
+        <w:t>complet</w:t>
+      </w:r>
+      <w:r>
+        <w:t>s</w:t>
+      </w:r>
+      <w:r>
+        <w:t xml:space="preserve"> d’un</w:t>
       </w:r>
       <w:r>
         <w:t xml:space="preserve"> calcul de l’indicateur d’intégrité fonctionnelle de la biosphère.</w:t>
@@ -30,15 +57,23 @@
         <w:pStyle w:val="Titre1"/>
       </w:pPr>
       <w:r>
-        <w:t xml:space="preserve">Déroulé du test </w:t>
-      </w:r>
+        <w:t xml:space="preserve">Déroulé du test 1 – </w:t>
+      </w:r>
+      <w:proofErr w:type="spellStart"/>
+      <w:r>
+        <w:t>Inte</w:t>
+      </w:r>
+      <w:r>
+        <w:t>grity_Raster</w:t>
+      </w:r>
+      <w:proofErr w:type="spellEnd"/>
     </w:p>
     <w:p>
       <w:pPr>
         <w:pStyle w:val="Titre2"/>
       </w:pPr>
       <w:r>
-        <w:t>Contenu du dossier</w:t>
+        <w:t xml:space="preserve"> Document du dossier pour ce test</w:t>
       </w:r>
     </w:p>
     <w:p>
@@ -48,75 +83,17 @@
           <w:ilvl w:val="0"/>
           <w:numId w:val="2"/>
         </w:numPr>
-        <w:rPr>
-          <w:lang w:val="en-GB"/>
-        </w:rPr>
       </w:pPr>
       <w:proofErr w:type="spellStart"/>
       <w:r>
-        <w:rPr>
-          <w:lang w:val="en-GB"/>
-        </w:rPr>
-        <w:t>Primary_layer_</w:t>
-      </w:r>
-      <w:proofErr w:type="gramStart"/>
-      <w:r>
-        <w:rPr>
-          <w:lang w:val="en-GB"/>
-        </w:rPr>
-        <w:t>COSIA.gpkg</w:t>
+        <w:t>Raster_layer_CLC.tif</w:t>
       </w:r>
       <w:proofErr w:type="spellEnd"/>
       <w:r>
-        <w:rPr>
-          <w:lang w:val="en-GB"/>
-        </w:rPr>
-        <w:t> :</w:t>
-      </w:r>
-      <w:proofErr w:type="gramEnd"/>
-      <w:r>
-        <w:rPr>
-          <w:lang w:val="en-GB"/>
-        </w:rPr>
-        <w:t xml:space="preserve"> </w:t>
-      </w:r>
-      <w:r>
-        <w:rPr>
-          <w:lang w:val="en-GB"/>
-        </w:rPr>
-        <w:t>champ</w:t>
-      </w:r>
-      <w:r>
-        <w:rPr>
-          <w:lang w:val="en-GB"/>
-        </w:rPr>
-        <w:t xml:space="preserve"> </w:t>
-      </w:r>
-      <w:r>
-        <w:rPr>
-          <w:lang w:val="en-GB"/>
-        </w:rPr>
-        <w:t xml:space="preserve">analyse </w:t>
-      </w:r>
-      <w:r>
-        <w:rPr>
-          <w:lang w:val="en-GB"/>
-        </w:rPr>
-        <w:t>“</w:t>
-      </w:r>
-      <w:proofErr w:type="spellStart"/>
-      <w:r>
-        <w:rPr>
-          <w:lang w:val="en-GB"/>
-        </w:rPr>
-        <w:t>numero</w:t>
-      </w:r>
-      <w:proofErr w:type="spellEnd"/>
-      <w:r>
-        <w:rPr>
-          <w:lang w:val="en-GB"/>
-        </w:rPr>
-        <w:t>”</w:t>
+        <w:t> : couve</w:t>
+      </w:r>
+      <w:r>
+        <w:t>rture des sols raster à analyser</w:t>
       </w:r>
     </w:p>
     <w:p>
@@ -126,71 +103,23 @@
           <w:ilvl w:val="0"/>
           <w:numId w:val="2"/>
         </w:numPr>
-        <w:rPr>
-          <w:lang w:val="en-GB"/>
-        </w:rPr>
       </w:pPr>
       <w:proofErr w:type="spellStart"/>
       <w:r>
-        <w:rPr>
-          <w:lang w:val="en-GB"/>
-        </w:rPr>
-        <w:t>Secondary_layer_</w:t>
-      </w:r>
-      <w:proofErr w:type="gramStart"/>
-      <w:r>
-        <w:rPr>
-          <w:lang w:val="en-GB"/>
-        </w:rPr>
-        <w:t>CarHab.gpkg</w:t>
+        <w:t>Raster_layer_CLC</w:t>
+      </w:r>
+      <w:r>
+        <w:t>.qml</w:t>
       </w:r>
       <w:proofErr w:type="spellEnd"/>
       <w:r>
-        <w:rPr>
-          <w:lang w:val="en-GB"/>
-        </w:rPr>
-        <w:t> :</w:t>
-      </w:r>
-      <w:proofErr w:type="gramEnd"/>
-      <w:r>
-        <w:rPr>
-          <w:lang w:val="en-GB"/>
-        </w:rPr>
-        <w:t xml:space="preserve"> </w:t>
-      </w:r>
-      <w:r>
-        <w:rPr>
-          <w:lang w:val="en-GB"/>
-        </w:rPr>
-        <w:t xml:space="preserve">champ </w:t>
-      </w:r>
-      <w:proofErr w:type="spellStart"/>
-      <w:r>
-        <w:rPr>
-          <w:lang w:val="en-GB"/>
-        </w:rPr>
-        <w:t>analysé</w:t>
-      </w:r>
-      <w:proofErr w:type="spellEnd"/>
-      <w:r>
-        <w:rPr>
-          <w:lang w:val="en-GB"/>
-        </w:rPr>
-        <w:t xml:space="preserve"> “</w:t>
-      </w:r>
-      <w:proofErr w:type="spellStart"/>
-      <w:r>
-        <w:rPr>
-          <w:lang w:val="en-GB"/>
-        </w:rPr>
-        <w:t>code_physio</w:t>
-      </w:r>
-      <w:proofErr w:type="spellEnd"/>
-      <w:r>
-        <w:rPr>
-          <w:lang w:val="en-GB"/>
-        </w:rPr>
-        <w:t>”</w:t>
+        <w:t> : fichier de style pour</w:t>
+      </w:r>
+      <w:r>
+        <w:t xml:space="preserve"> représenter la </w:t>
+      </w:r>
+      <w:r>
+        <w:t>couche raster</w:t>
       </w:r>
     </w:p>
     <w:p>
@@ -203,20 +132,12 @@
       </w:pPr>
       <w:proofErr w:type="spellStart"/>
       <w:r>
-        <w:t>Primary_layer_COSIA.qml</w:t>
+        <w:t>Emprise.gpkg</w:t>
       </w:r>
       <w:proofErr w:type="spellEnd"/>
       <w:r>
-        <w:t> : fichier de style pour</w:t>
-      </w:r>
-      <w:r>
-        <w:t xml:space="preserve"> représenter la légende fournie dans la notice de la couche </w:t>
-      </w:r>
-      <w:proofErr w:type="spellStart"/>
-      <w:r>
-        <w:t>numero</w:t>
-      </w:r>
-      <w:proofErr w:type="spellEnd"/>
+        <w:t> : zone sur laquelle faire le calcul d’intégrité</w:t>
+      </w:r>
     </w:p>
     <w:p>
       <w:pPr>
@@ -226,28 +147,1286 @@
           <w:numId w:val="2"/>
         </w:numPr>
       </w:pPr>
+      <w:r>
+        <w:t>CLCplus_Backbone_2023_Documentation</w:t>
+      </w:r>
+      <w:r>
+        <w:t>.pdf : pour avoir accès aux classifications de couverture des sols inclues dans la couche à analyser</w:t>
+      </w:r>
+    </w:p>
+    <w:p>
+      <w:pPr>
+        <w:pStyle w:val="Titre2"/>
+      </w:pPr>
+      <w:r>
+        <w:t>Calcul de l’intégrité de la biosphère</w:t>
+      </w:r>
+    </w:p>
+    <w:p>
+      <w:r>
+        <w:t xml:space="preserve">Nous proposons la classification suivante de cette couche : </w:t>
+      </w:r>
+    </w:p>
+    <w:tbl>
+      <w:tblPr>
+        <w:tblStyle w:val="Grilledutableau"/>
+        <w:tblW w:w="0" w:type="auto"/>
+        <w:tblLook w:val="04A0" w:firstRow="1" w:lastRow="0" w:firstColumn="1" w:lastColumn="0" w:noHBand="0" w:noVBand="1"/>
+      </w:tblPr>
+      <w:tblGrid>
+        <w:gridCol w:w="3020"/>
+        <w:gridCol w:w="3021"/>
+        <w:gridCol w:w="3021"/>
+      </w:tblGrid>
+      <w:tr>
+        <w:tc>
+          <w:tcPr>
+            <w:tcW w:w="3020" w:type="dxa"/>
+            <w:vAlign w:val="bottom"/>
+          </w:tcPr>
+          <w:p>
+            <w:proofErr w:type="spellStart"/>
+            <w:r>
+              <w:rPr>
+                <w:rFonts w:ascii="Calibri" w:hAnsi="Calibri" w:cs="Calibri"/>
+                <w:color w:val="000000"/>
+              </w:rPr>
+              <w:t>Number</w:t>
+            </w:r>
+            <w:proofErr w:type="spellEnd"/>
+          </w:p>
+        </w:tc>
+        <w:tc>
+          <w:tcPr>
+            <w:tcW w:w="3021" w:type="dxa"/>
+            <w:vAlign w:val="bottom"/>
+          </w:tcPr>
+          <w:p>
+            <w:r>
+              <w:rPr>
+                <w:rFonts w:ascii="Calibri" w:hAnsi="Calibri" w:cs="Calibri"/>
+                <w:color w:val="000000"/>
+              </w:rPr>
+              <w:t>Land cover</w:t>
+            </w:r>
+          </w:p>
+        </w:tc>
+        <w:tc>
+          <w:tcPr>
+            <w:tcW w:w="3021" w:type="dxa"/>
+          </w:tcPr>
+          <w:p>
+            <w:r>
+              <w:t>Classification binaire</w:t>
+            </w:r>
+          </w:p>
+        </w:tc>
+      </w:tr>
+      <w:tr>
+        <w:tc>
+          <w:tcPr>
+            <w:tcW w:w="3020" w:type="dxa"/>
+            <w:vAlign w:val="bottom"/>
+          </w:tcPr>
+          <w:p>
+            <w:r>
+              <w:rPr>
+                <w:rFonts w:ascii="Calibri" w:hAnsi="Calibri" w:cs="Calibri"/>
+                <w:color w:val="000000"/>
+              </w:rPr>
+              <w:t>1</w:t>
+            </w:r>
+          </w:p>
+        </w:tc>
+        <w:tc>
+          <w:tcPr>
+            <w:tcW w:w="3021" w:type="dxa"/>
+            <w:vAlign w:val="bottom"/>
+          </w:tcPr>
+          <w:p>
+            <w:proofErr w:type="spellStart"/>
+            <w:r>
+              <w:rPr>
+                <w:rFonts w:ascii="Calibri" w:hAnsi="Calibri" w:cs="Calibri"/>
+                <w:color w:val="000000"/>
+              </w:rPr>
+              <w:t>Sealed</w:t>
+            </w:r>
+            <w:proofErr w:type="spellEnd"/>
+          </w:p>
+        </w:tc>
+        <w:tc>
+          <w:tcPr>
+            <w:tcW w:w="3021" w:type="dxa"/>
+          </w:tcPr>
+          <w:p>
+            <w:r>
+              <w:t>0</w:t>
+            </w:r>
+          </w:p>
+        </w:tc>
+      </w:tr>
+      <w:tr>
+        <w:tc>
+          <w:tcPr>
+            <w:tcW w:w="3020" w:type="dxa"/>
+            <w:vAlign w:val="bottom"/>
+          </w:tcPr>
+          <w:p>
+            <w:r>
+              <w:rPr>
+                <w:rFonts w:ascii="Calibri" w:hAnsi="Calibri" w:cs="Calibri"/>
+                <w:color w:val="000000"/>
+              </w:rPr>
+              <w:t>2</w:t>
+            </w:r>
+          </w:p>
+        </w:tc>
+        <w:tc>
+          <w:tcPr>
+            <w:tcW w:w="3021" w:type="dxa"/>
+            <w:vAlign w:val="bottom"/>
+          </w:tcPr>
+          <w:p>
+            <w:r>
+              <w:rPr>
+                <w:rFonts w:ascii="Calibri" w:hAnsi="Calibri" w:cs="Calibri"/>
+                <w:color w:val="000000"/>
+              </w:rPr>
+              <w:t xml:space="preserve">Woody </w:t>
+            </w:r>
+            <w:proofErr w:type="spellStart"/>
+            <w:r>
+              <w:rPr>
+                <w:rFonts w:ascii="Calibri" w:hAnsi="Calibri" w:cs="Calibri"/>
+                <w:color w:val="000000"/>
+              </w:rPr>
+              <w:t>needle</w:t>
+            </w:r>
+            <w:proofErr w:type="spellEnd"/>
+            <w:r>
+              <w:rPr>
+                <w:rFonts w:ascii="Calibri" w:hAnsi="Calibri" w:cs="Calibri"/>
+                <w:color w:val="000000"/>
+              </w:rPr>
+              <w:t xml:space="preserve"> </w:t>
+            </w:r>
+            <w:proofErr w:type="spellStart"/>
+            <w:r>
+              <w:rPr>
+                <w:rFonts w:ascii="Calibri" w:hAnsi="Calibri" w:cs="Calibri"/>
+                <w:color w:val="000000"/>
+              </w:rPr>
+              <w:t>leaved</w:t>
+            </w:r>
+            <w:proofErr w:type="spellEnd"/>
+            <w:r>
+              <w:rPr>
+                <w:rFonts w:ascii="Calibri" w:hAnsi="Calibri" w:cs="Calibri"/>
+                <w:color w:val="000000"/>
+              </w:rPr>
+              <w:t xml:space="preserve"> </w:t>
+            </w:r>
+            <w:proofErr w:type="spellStart"/>
+            <w:r>
+              <w:rPr>
+                <w:rFonts w:ascii="Calibri" w:hAnsi="Calibri" w:cs="Calibri"/>
+                <w:color w:val="000000"/>
+              </w:rPr>
+              <w:t>trees</w:t>
+            </w:r>
+            <w:proofErr w:type="spellEnd"/>
+          </w:p>
+        </w:tc>
+        <w:tc>
+          <w:tcPr>
+            <w:tcW w:w="3021" w:type="dxa"/>
+          </w:tcPr>
+          <w:p>
+            <w:r>
+              <w:t>1</w:t>
+            </w:r>
+          </w:p>
+        </w:tc>
+      </w:tr>
+      <w:tr>
+        <w:tc>
+          <w:tcPr>
+            <w:tcW w:w="3020" w:type="dxa"/>
+            <w:vAlign w:val="bottom"/>
+          </w:tcPr>
+          <w:p>
+            <w:r>
+              <w:rPr>
+                <w:rFonts w:ascii="Calibri" w:hAnsi="Calibri" w:cs="Calibri"/>
+                <w:color w:val="000000"/>
+              </w:rPr>
+              <w:t>3</w:t>
+            </w:r>
+          </w:p>
+        </w:tc>
+        <w:tc>
+          <w:tcPr>
+            <w:tcW w:w="3021" w:type="dxa"/>
+            <w:vAlign w:val="bottom"/>
+          </w:tcPr>
+          <w:p>
+            <w:r>
+              <w:rPr>
+                <w:rFonts w:ascii="Calibri" w:hAnsi="Calibri" w:cs="Calibri"/>
+                <w:color w:val="000000"/>
+              </w:rPr>
+              <w:t xml:space="preserve">Woody </w:t>
+            </w:r>
+            <w:proofErr w:type="spellStart"/>
+            <w:r>
+              <w:rPr>
+                <w:rFonts w:ascii="Calibri" w:hAnsi="Calibri" w:cs="Calibri"/>
+                <w:color w:val="000000"/>
+              </w:rPr>
+              <w:t>broadleaved</w:t>
+            </w:r>
+            <w:proofErr w:type="spellEnd"/>
+            <w:r>
+              <w:rPr>
+                <w:rFonts w:ascii="Calibri" w:hAnsi="Calibri" w:cs="Calibri"/>
+                <w:color w:val="000000"/>
+              </w:rPr>
+              <w:t xml:space="preserve"> </w:t>
+            </w:r>
+            <w:proofErr w:type="spellStart"/>
+            <w:r>
+              <w:rPr>
+                <w:rFonts w:ascii="Calibri" w:hAnsi="Calibri" w:cs="Calibri"/>
+                <w:color w:val="000000"/>
+              </w:rPr>
+              <w:t>deciduous</w:t>
+            </w:r>
+            <w:proofErr w:type="spellEnd"/>
+            <w:r>
+              <w:rPr>
+                <w:rFonts w:ascii="Calibri" w:hAnsi="Calibri" w:cs="Calibri"/>
+                <w:color w:val="000000"/>
+              </w:rPr>
+              <w:t xml:space="preserve"> </w:t>
+            </w:r>
+            <w:proofErr w:type="spellStart"/>
+            <w:r>
+              <w:rPr>
+                <w:rFonts w:ascii="Calibri" w:hAnsi="Calibri" w:cs="Calibri"/>
+                <w:color w:val="000000"/>
+              </w:rPr>
+              <w:t>trees</w:t>
+            </w:r>
+            <w:proofErr w:type="spellEnd"/>
+          </w:p>
+        </w:tc>
+        <w:tc>
+          <w:tcPr>
+            <w:tcW w:w="3021" w:type="dxa"/>
+          </w:tcPr>
+          <w:p>
+            <w:r>
+              <w:t>1</w:t>
+            </w:r>
+          </w:p>
+        </w:tc>
+      </w:tr>
+      <w:tr>
+        <w:tc>
+          <w:tcPr>
+            <w:tcW w:w="3020" w:type="dxa"/>
+            <w:vAlign w:val="bottom"/>
+          </w:tcPr>
+          <w:p>
+            <w:r>
+              <w:rPr>
+                <w:rFonts w:ascii="Calibri" w:hAnsi="Calibri" w:cs="Calibri"/>
+                <w:color w:val="000000"/>
+              </w:rPr>
+              <w:t>4</w:t>
+            </w:r>
+          </w:p>
+        </w:tc>
+        <w:tc>
+          <w:tcPr>
+            <w:tcW w:w="3021" w:type="dxa"/>
+            <w:vAlign w:val="bottom"/>
+          </w:tcPr>
+          <w:p>
+            <w:r>
+              <w:rPr>
+                <w:rFonts w:ascii="Calibri" w:hAnsi="Calibri" w:cs="Calibri"/>
+                <w:color w:val="000000"/>
+              </w:rPr>
+              <w:t xml:space="preserve">Woody </w:t>
+            </w:r>
+            <w:proofErr w:type="spellStart"/>
+            <w:r>
+              <w:rPr>
+                <w:rFonts w:ascii="Calibri" w:hAnsi="Calibri" w:cs="Calibri"/>
+                <w:color w:val="000000"/>
+              </w:rPr>
+              <w:t>broadleaved</w:t>
+            </w:r>
+            <w:proofErr w:type="spellEnd"/>
+            <w:r>
+              <w:rPr>
+                <w:rFonts w:ascii="Calibri" w:hAnsi="Calibri" w:cs="Calibri"/>
+                <w:color w:val="000000"/>
+              </w:rPr>
+              <w:t xml:space="preserve"> </w:t>
+            </w:r>
+            <w:proofErr w:type="spellStart"/>
+            <w:r>
+              <w:rPr>
+                <w:rFonts w:ascii="Calibri" w:hAnsi="Calibri" w:cs="Calibri"/>
+                <w:color w:val="000000"/>
+              </w:rPr>
+              <w:t>evergreen</w:t>
+            </w:r>
+            <w:proofErr w:type="spellEnd"/>
+            <w:r>
+              <w:rPr>
+                <w:rFonts w:ascii="Calibri" w:hAnsi="Calibri" w:cs="Calibri"/>
+                <w:color w:val="000000"/>
+              </w:rPr>
+              <w:t xml:space="preserve"> </w:t>
+            </w:r>
+            <w:proofErr w:type="spellStart"/>
+            <w:r>
+              <w:rPr>
+                <w:rFonts w:ascii="Calibri" w:hAnsi="Calibri" w:cs="Calibri"/>
+                <w:color w:val="000000"/>
+              </w:rPr>
+              <w:t>trees</w:t>
+            </w:r>
+            <w:proofErr w:type="spellEnd"/>
+          </w:p>
+        </w:tc>
+        <w:tc>
+          <w:tcPr>
+            <w:tcW w:w="3021" w:type="dxa"/>
+          </w:tcPr>
+          <w:p>
+            <w:r>
+              <w:t>1</w:t>
+            </w:r>
+          </w:p>
+        </w:tc>
+      </w:tr>
+      <w:tr>
+        <w:tc>
+          <w:tcPr>
+            <w:tcW w:w="3020" w:type="dxa"/>
+            <w:vAlign w:val="bottom"/>
+          </w:tcPr>
+          <w:p>
+            <w:r>
+              <w:rPr>
+                <w:rFonts w:ascii="Calibri" w:hAnsi="Calibri" w:cs="Calibri"/>
+                <w:color w:val="000000"/>
+              </w:rPr>
+              <w:t>5</w:t>
+            </w:r>
+          </w:p>
+        </w:tc>
+        <w:tc>
+          <w:tcPr>
+            <w:tcW w:w="3021" w:type="dxa"/>
+            <w:vAlign w:val="bottom"/>
+          </w:tcPr>
+          <w:p>
+            <w:r>
+              <w:rPr>
+                <w:rFonts w:ascii="Calibri" w:hAnsi="Calibri" w:cs="Calibri"/>
+                <w:color w:val="000000"/>
+              </w:rPr>
+              <w:t>Low-</w:t>
+            </w:r>
+            <w:proofErr w:type="spellStart"/>
+            <w:r>
+              <w:rPr>
+                <w:rFonts w:ascii="Calibri" w:hAnsi="Calibri" w:cs="Calibri"/>
+                <w:color w:val="000000"/>
+              </w:rPr>
+              <w:t>growing</w:t>
+            </w:r>
+            <w:proofErr w:type="spellEnd"/>
+            <w:r>
+              <w:rPr>
+                <w:rFonts w:ascii="Calibri" w:hAnsi="Calibri" w:cs="Calibri"/>
+                <w:color w:val="000000"/>
+              </w:rPr>
+              <w:t xml:space="preserve"> </w:t>
+            </w:r>
+            <w:proofErr w:type="spellStart"/>
+            <w:r>
+              <w:rPr>
+                <w:rFonts w:ascii="Calibri" w:hAnsi="Calibri" w:cs="Calibri"/>
+                <w:color w:val="000000"/>
+              </w:rPr>
+              <w:t>woody</w:t>
+            </w:r>
+            <w:proofErr w:type="spellEnd"/>
+            <w:r>
+              <w:rPr>
+                <w:rFonts w:ascii="Calibri" w:hAnsi="Calibri" w:cs="Calibri"/>
+                <w:color w:val="000000"/>
+              </w:rPr>
+              <w:t xml:space="preserve"> plants</w:t>
+            </w:r>
+          </w:p>
+        </w:tc>
+        <w:tc>
+          <w:tcPr>
+            <w:tcW w:w="3021" w:type="dxa"/>
+          </w:tcPr>
+          <w:p>
+            <w:r>
+              <w:t>1</w:t>
+            </w:r>
+          </w:p>
+        </w:tc>
+      </w:tr>
+      <w:tr>
+        <w:tc>
+          <w:tcPr>
+            <w:tcW w:w="3020" w:type="dxa"/>
+            <w:vAlign w:val="bottom"/>
+          </w:tcPr>
+          <w:p>
+            <w:r>
+              <w:rPr>
+                <w:rFonts w:ascii="Calibri" w:hAnsi="Calibri" w:cs="Calibri"/>
+                <w:color w:val="000000"/>
+              </w:rPr>
+              <w:t>6</w:t>
+            </w:r>
+          </w:p>
+        </w:tc>
+        <w:tc>
+          <w:tcPr>
+            <w:tcW w:w="3021" w:type="dxa"/>
+            <w:vAlign w:val="bottom"/>
+          </w:tcPr>
+          <w:p>
+            <w:r>
+              <w:rPr>
+                <w:rFonts w:ascii="Calibri" w:hAnsi="Calibri" w:cs="Calibri"/>
+                <w:color w:val="000000"/>
+              </w:rPr>
+              <w:t xml:space="preserve">Permanent </w:t>
+            </w:r>
+            <w:proofErr w:type="spellStart"/>
+            <w:r>
+              <w:rPr>
+                <w:rFonts w:ascii="Calibri" w:hAnsi="Calibri" w:cs="Calibri"/>
+                <w:color w:val="000000"/>
+              </w:rPr>
+              <w:t>herbaceous</w:t>
+            </w:r>
+            <w:proofErr w:type="spellEnd"/>
+          </w:p>
+        </w:tc>
+        <w:tc>
+          <w:tcPr>
+            <w:tcW w:w="3021" w:type="dxa"/>
+          </w:tcPr>
+          <w:p>
+            <w:r>
+              <w:t>1</w:t>
+            </w:r>
+          </w:p>
+        </w:tc>
+      </w:tr>
+      <w:tr>
+        <w:tc>
+          <w:tcPr>
+            <w:tcW w:w="3020" w:type="dxa"/>
+            <w:vAlign w:val="bottom"/>
+          </w:tcPr>
+          <w:p>
+            <w:r>
+              <w:rPr>
+                <w:rFonts w:ascii="Calibri" w:hAnsi="Calibri" w:cs="Calibri"/>
+                <w:color w:val="000000"/>
+              </w:rPr>
+              <w:t>7</w:t>
+            </w:r>
+          </w:p>
+        </w:tc>
+        <w:tc>
+          <w:tcPr>
+            <w:tcW w:w="3021" w:type="dxa"/>
+            <w:vAlign w:val="bottom"/>
+          </w:tcPr>
+          <w:p>
+            <w:proofErr w:type="spellStart"/>
+            <w:r>
+              <w:rPr>
+                <w:rFonts w:ascii="Calibri" w:hAnsi="Calibri" w:cs="Calibri"/>
+                <w:color w:val="000000"/>
+              </w:rPr>
+              <w:t>Periodically</w:t>
+            </w:r>
+            <w:proofErr w:type="spellEnd"/>
+            <w:r>
+              <w:rPr>
+                <w:rFonts w:ascii="Calibri" w:hAnsi="Calibri" w:cs="Calibri"/>
+                <w:color w:val="000000"/>
+              </w:rPr>
+              <w:t xml:space="preserve"> </w:t>
+            </w:r>
+            <w:proofErr w:type="spellStart"/>
+            <w:r>
+              <w:rPr>
+                <w:rFonts w:ascii="Calibri" w:hAnsi="Calibri" w:cs="Calibri"/>
+                <w:color w:val="000000"/>
+              </w:rPr>
+              <w:t>herbaceous</w:t>
+            </w:r>
+            <w:proofErr w:type="spellEnd"/>
+          </w:p>
+        </w:tc>
+        <w:tc>
+          <w:tcPr>
+            <w:tcW w:w="3021" w:type="dxa"/>
+          </w:tcPr>
+          <w:p>
+            <w:r>
+              <w:t>0</w:t>
+            </w:r>
+          </w:p>
+        </w:tc>
+      </w:tr>
+      <w:tr>
+        <w:tc>
+          <w:tcPr>
+            <w:tcW w:w="3020" w:type="dxa"/>
+            <w:vAlign w:val="bottom"/>
+          </w:tcPr>
+          <w:p>
+            <w:r>
+              <w:rPr>
+                <w:rFonts w:ascii="Calibri" w:hAnsi="Calibri" w:cs="Calibri"/>
+                <w:color w:val="000000"/>
+              </w:rPr>
+              <w:t>8</w:t>
+            </w:r>
+          </w:p>
+        </w:tc>
+        <w:tc>
+          <w:tcPr>
+            <w:tcW w:w="3021" w:type="dxa"/>
+            <w:vAlign w:val="bottom"/>
+          </w:tcPr>
+          <w:p>
+            <w:r>
+              <w:rPr>
+                <w:rFonts w:ascii="Calibri" w:hAnsi="Calibri" w:cs="Calibri"/>
+                <w:color w:val="000000"/>
+              </w:rPr>
+              <w:t xml:space="preserve">Lichens and </w:t>
+            </w:r>
+            <w:proofErr w:type="spellStart"/>
+            <w:r>
+              <w:rPr>
+                <w:rFonts w:ascii="Calibri" w:hAnsi="Calibri" w:cs="Calibri"/>
+                <w:color w:val="000000"/>
+              </w:rPr>
+              <w:t>mosses</w:t>
+            </w:r>
+            <w:proofErr w:type="spellEnd"/>
+          </w:p>
+        </w:tc>
+        <w:tc>
+          <w:tcPr>
+            <w:tcW w:w="3021" w:type="dxa"/>
+          </w:tcPr>
+          <w:p>
+            <w:r>
+              <w:t>1</w:t>
+            </w:r>
+          </w:p>
+        </w:tc>
+      </w:tr>
+      <w:tr>
+        <w:tc>
+          <w:tcPr>
+            <w:tcW w:w="3020" w:type="dxa"/>
+            <w:vAlign w:val="bottom"/>
+          </w:tcPr>
+          <w:p>
+            <w:r>
+              <w:rPr>
+                <w:rFonts w:ascii="Calibri" w:hAnsi="Calibri" w:cs="Calibri"/>
+                <w:color w:val="000000"/>
+              </w:rPr>
+              <w:t>9</w:t>
+            </w:r>
+          </w:p>
+        </w:tc>
+        <w:tc>
+          <w:tcPr>
+            <w:tcW w:w="3021" w:type="dxa"/>
+            <w:vAlign w:val="bottom"/>
+          </w:tcPr>
+          <w:p>
+            <w:r>
+              <w:rPr>
+                <w:rFonts w:ascii="Calibri" w:hAnsi="Calibri" w:cs="Calibri"/>
+                <w:color w:val="000000"/>
+              </w:rPr>
+              <w:t xml:space="preserve">Non- and </w:t>
+            </w:r>
+            <w:proofErr w:type="spellStart"/>
+            <w:r>
+              <w:rPr>
+                <w:rFonts w:ascii="Calibri" w:hAnsi="Calibri" w:cs="Calibri"/>
+                <w:color w:val="000000"/>
+              </w:rPr>
+              <w:t>sparsely</w:t>
+            </w:r>
+            <w:proofErr w:type="spellEnd"/>
+            <w:r>
+              <w:rPr>
+                <w:rFonts w:ascii="Calibri" w:hAnsi="Calibri" w:cs="Calibri"/>
+                <w:color w:val="000000"/>
+              </w:rPr>
+              <w:t xml:space="preserve"> </w:t>
+            </w:r>
+            <w:proofErr w:type="spellStart"/>
+            <w:r>
+              <w:rPr>
+                <w:rFonts w:ascii="Calibri" w:hAnsi="Calibri" w:cs="Calibri"/>
+                <w:color w:val="000000"/>
+              </w:rPr>
+              <w:t>vegetated</w:t>
+            </w:r>
+            <w:proofErr w:type="spellEnd"/>
+          </w:p>
+        </w:tc>
+        <w:tc>
+          <w:tcPr>
+            <w:tcW w:w="3021" w:type="dxa"/>
+          </w:tcPr>
+          <w:p>
+            <w:r>
+              <w:t>NA</w:t>
+            </w:r>
+          </w:p>
+        </w:tc>
+      </w:tr>
+      <w:tr>
+        <w:tc>
+          <w:tcPr>
+            <w:tcW w:w="3020" w:type="dxa"/>
+            <w:vAlign w:val="bottom"/>
+          </w:tcPr>
+          <w:p>
+            <w:r>
+              <w:rPr>
+                <w:rFonts w:ascii="Calibri" w:hAnsi="Calibri" w:cs="Calibri"/>
+                <w:color w:val="000000"/>
+              </w:rPr>
+              <w:t>10</w:t>
+            </w:r>
+          </w:p>
+        </w:tc>
+        <w:tc>
+          <w:tcPr>
+            <w:tcW w:w="3021" w:type="dxa"/>
+            <w:vAlign w:val="bottom"/>
+          </w:tcPr>
+          <w:p>
+            <w:r>
+              <w:rPr>
+                <w:rFonts w:ascii="Calibri" w:hAnsi="Calibri" w:cs="Calibri"/>
+                <w:color w:val="000000"/>
+              </w:rPr>
+              <w:t>Water</w:t>
+            </w:r>
+          </w:p>
+        </w:tc>
+        <w:tc>
+          <w:tcPr>
+            <w:tcW w:w="3021" w:type="dxa"/>
+          </w:tcPr>
+          <w:p>
+            <w:r>
+              <w:t>NA</w:t>
+            </w:r>
+          </w:p>
+        </w:tc>
+      </w:tr>
+      <w:tr>
+        <w:tc>
+          <w:tcPr>
+            <w:tcW w:w="3020" w:type="dxa"/>
+            <w:vAlign w:val="bottom"/>
+          </w:tcPr>
+          <w:p>
+            <w:r>
+              <w:rPr>
+                <w:rFonts w:ascii="Calibri" w:hAnsi="Calibri" w:cs="Calibri"/>
+                <w:color w:val="000000"/>
+              </w:rPr>
+              <w:t>11</w:t>
+            </w:r>
+          </w:p>
+        </w:tc>
+        <w:tc>
+          <w:tcPr>
+            <w:tcW w:w="3021" w:type="dxa"/>
+            <w:vAlign w:val="bottom"/>
+          </w:tcPr>
+          <w:p>
+            <w:r>
+              <w:rPr>
+                <w:rFonts w:ascii="Calibri" w:hAnsi="Calibri" w:cs="Calibri"/>
+                <w:color w:val="000000"/>
+              </w:rPr>
+              <w:t xml:space="preserve">Snow and </w:t>
+            </w:r>
+            <w:proofErr w:type="spellStart"/>
+            <w:r>
+              <w:rPr>
+                <w:rFonts w:ascii="Calibri" w:hAnsi="Calibri" w:cs="Calibri"/>
+                <w:color w:val="000000"/>
+              </w:rPr>
+              <w:t>ice</w:t>
+            </w:r>
+            <w:proofErr w:type="spellEnd"/>
+          </w:p>
+        </w:tc>
+        <w:tc>
+          <w:tcPr>
+            <w:tcW w:w="3021" w:type="dxa"/>
+          </w:tcPr>
+          <w:p>
+            <w:r>
+              <w:t>NA</w:t>
+            </w:r>
+          </w:p>
+        </w:tc>
+      </w:tr>
+    </w:tbl>
+    <w:p/>
+    <w:p>
+      <w:r>
+        <w:t xml:space="preserve">Cela se traduit par le bloc de commande suivant à entrer dans </w:t>
+      </w:r>
       <w:proofErr w:type="spellStart"/>
       <w:r>
-        <w:t>Secondary_layer_CarHab</w:t>
-      </w:r>
-      <w:r>
-        <w:t>.qml</w:t>
+        <w:t>Integrity_</w:t>
+      </w:r>
+      <w:r>
+        <w:t>Raster</w:t>
       </w:r>
       <w:proofErr w:type="spellEnd"/>
       <w:r>
-        <w:t xml:space="preserve"> : </w:t>
-      </w:r>
-      <w:r>
-        <w:t>fichier de style pour</w:t>
-      </w:r>
-      <w:r>
-        <w:t xml:space="preserve"> représenter la légende fournie dans la notice de la couche </w:t>
+        <w:t> :</w:t>
+      </w:r>
+    </w:p>
+    <w:p>
+      <w:pPr>
+        <w:shd w:val="clear" w:color="auto" w:fill="121314"/>
+        <w:spacing w:line="285" w:lineRule="atLeast"/>
+        <w:rPr>
+          <w:rFonts w:ascii="Consolas" w:eastAsia="Times New Roman" w:hAnsi="Consolas" w:cs="Times New Roman"/>
+          <w:color w:val="BBBEBF"/>
+          <w:sz w:val="21"/>
+          <w:szCs w:val="21"/>
+          <w:lang w:eastAsia="fr-FR"/>
+        </w:rPr>
+      </w:pPr>
+      <w:r>
+        <w:rPr>
+          <w:rFonts w:ascii="Consolas" w:eastAsia="Times New Roman" w:hAnsi="Consolas" w:cs="Times New Roman"/>
+          <w:color w:val="79C0FF"/>
+          <w:sz w:val="21"/>
+          <w:szCs w:val="21"/>
+          <w:lang w:eastAsia="fr-FR"/>
+        </w:rPr>
+        <w:t>CLASSES_</w:t>
+      </w:r>
+      <w:proofErr w:type="gramStart"/>
+      <w:r>
+        <w:rPr>
+          <w:rFonts w:ascii="Consolas" w:eastAsia="Times New Roman" w:hAnsi="Consolas" w:cs="Times New Roman"/>
+          <w:color w:val="79C0FF"/>
+          <w:sz w:val="21"/>
+          <w:szCs w:val="21"/>
+          <w:lang w:eastAsia="fr-FR"/>
+        </w:rPr>
+        <w:t>1</w:t>
+      </w:r>
+      <w:r>
+        <w:rPr>
+          <w:rFonts w:ascii="Consolas" w:eastAsia="Times New Roman" w:hAnsi="Consolas" w:cs="Times New Roman"/>
+          <w:color w:val="BBBEBF"/>
+          <w:sz w:val="21"/>
+          <w:szCs w:val="21"/>
+          <w:lang w:eastAsia="fr-FR"/>
+        </w:rPr>
+        <w:t>:</w:t>
+      </w:r>
+      <w:proofErr w:type="gramEnd"/>
+      <w:r>
+        <w:rPr>
+          <w:rFonts w:ascii="Consolas" w:eastAsia="Times New Roman" w:hAnsi="Consolas" w:cs="Times New Roman"/>
+          <w:color w:val="BBBEBF"/>
+          <w:sz w:val="21"/>
+          <w:szCs w:val="21"/>
+          <w:lang w:eastAsia="fr-FR"/>
+        </w:rPr>
+        <w:t xml:space="preserve"> </w:t>
       </w:r>
       <w:proofErr w:type="spellStart"/>
       <w:r>
-        <w:t>code_physio</w:t>
+        <w:rPr>
+          <w:rFonts w:ascii="Consolas" w:eastAsia="Times New Roman" w:hAnsi="Consolas" w:cs="Times New Roman"/>
+          <w:color w:val="4EC9B0"/>
+          <w:sz w:val="21"/>
+          <w:szCs w:val="21"/>
+          <w:lang w:eastAsia="fr-FR"/>
+        </w:rPr>
+        <w:t>str</w:t>
       </w:r>
       <w:proofErr w:type="spellEnd"/>
+      <w:r>
+        <w:rPr>
+          <w:rFonts w:ascii="Consolas" w:eastAsia="Times New Roman" w:hAnsi="Consolas" w:cs="Times New Roman"/>
+          <w:color w:val="BBBEBF"/>
+          <w:sz w:val="21"/>
+          <w:szCs w:val="21"/>
+          <w:lang w:eastAsia="fr-FR"/>
+        </w:rPr>
+        <w:t xml:space="preserve"> </w:t>
+      </w:r>
+      <w:r>
+        <w:rPr>
+          <w:rFonts w:ascii="Consolas" w:eastAsia="Times New Roman" w:hAnsi="Consolas" w:cs="Times New Roman"/>
+          <w:color w:val="D4D4D4"/>
+          <w:sz w:val="21"/>
+          <w:szCs w:val="21"/>
+          <w:lang w:eastAsia="fr-FR"/>
+        </w:rPr>
+        <w:t>=</w:t>
+      </w:r>
+      <w:r>
+        <w:rPr>
+          <w:rFonts w:ascii="Consolas" w:eastAsia="Times New Roman" w:hAnsi="Consolas" w:cs="Times New Roman"/>
+          <w:color w:val="BBBEBF"/>
+          <w:sz w:val="21"/>
+          <w:szCs w:val="21"/>
+          <w:lang w:eastAsia="fr-FR"/>
+        </w:rPr>
+        <w:t xml:space="preserve"> </w:t>
+      </w:r>
+      <w:r>
+        <w:rPr>
+          <w:rFonts w:ascii="Consolas" w:eastAsia="Times New Roman" w:hAnsi="Consolas" w:cs="Times New Roman"/>
+          <w:color w:val="A5D6FF"/>
+          <w:sz w:val="21"/>
+          <w:szCs w:val="21"/>
+          <w:lang w:eastAsia="fr-FR"/>
+        </w:rPr>
+        <w:t>"2 3 4 5 6 8"</w:t>
+      </w:r>
+      <w:r>
+        <w:rPr>
+          <w:rFonts w:ascii="Consolas" w:eastAsia="Times New Roman" w:hAnsi="Consolas" w:cs="Times New Roman"/>
+          <w:color w:val="BBBEBF"/>
+          <w:sz w:val="21"/>
+          <w:szCs w:val="21"/>
+          <w:lang w:eastAsia="fr-FR"/>
+        </w:rPr>
+        <w:t xml:space="preserve">                        </w:t>
+      </w:r>
+      <w:r>
+        <w:rPr>
+          <w:rFonts w:ascii="Consolas" w:eastAsia="Times New Roman" w:hAnsi="Consolas" w:cs="Times New Roman"/>
+          <w:color w:val="8B949E"/>
+          <w:sz w:val="21"/>
+          <w:szCs w:val="21"/>
+          <w:lang w:eastAsia="fr-FR"/>
+        </w:rPr>
+        <w:t># semi-</w:t>
+      </w:r>
+      <w:proofErr w:type="spellStart"/>
+      <w:r>
+        <w:rPr>
+          <w:rFonts w:ascii="Consolas" w:eastAsia="Times New Roman" w:hAnsi="Consolas" w:cs="Times New Roman"/>
+          <w:color w:val="8B949E"/>
+          <w:sz w:val="21"/>
+          <w:szCs w:val="21"/>
+          <w:lang w:eastAsia="fr-FR"/>
+        </w:rPr>
+        <w:t>natural</w:t>
+      </w:r>
+      <w:proofErr w:type="spellEnd"/>
+      <w:r>
+        <w:rPr>
+          <w:rFonts w:ascii="Consolas" w:eastAsia="Times New Roman" w:hAnsi="Consolas" w:cs="Times New Roman"/>
+          <w:color w:val="8B949E"/>
+          <w:sz w:val="21"/>
+          <w:szCs w:val="21"/>
+          <w:lang w:eastAsia="fr-FR"/>
+        </w:rPr>
+        <w:t xml:space="preserve"> = 1</w:t>
+      </w:r>
+    </w:p>
+    <w:p>
+      <w:pPr>
+        <w:shd w:val="clear" w:color="auto" w:fill="121314"/>
+        <w:spacing w:line="285" w:lineRule="atLeast"/>
+        <w:rPr>
+          <w:rFonts w:ascii="Consolas" w:eastAsia="Times New Roman" w:hAnsi="Consolas" w:cs="Times New Roman"/>
+          <w:color w:val="BBBEBF"/>
+          <w:sz w:val="21"/>
+          <w:szCs w:val="21"/>
+          <w:lang w:eastAsia="fr-FR"/>
+        </w:rPr>
+      </w:pPr>
+      <w:r>
+        <w:rPr>
+          <w:rFonts w:ascii="Consolas" w:eastAsia="Times New Roman" w:hAnsi="Consolas" w:cs="Times New Roman"/>
+          <w:color w:val="79C0FF"/>
+          <w:sz w:val="21"/>
+          <w:szCs w:val="21"/>
+          <w:lang w:eastAsia="fr-FR"/>
+        </w:rPr>
+        <w:t>CLASSES_</w:t>
+      </w:r>
+      <w:proofErr w:type="gramStart"/>
+      <w:r>
+        <w:rPr>
+          <w:rFonts w:ascii="Consolas" w:eastAsia="Times New Roman" w:hAnsi="Consolas" w:cs="Times New Roman"/>
+          <w:color w:val="79C0FF"/>
+          <w:sz w:val="21"/>
+          <w:szCs w:val="21"/>
+          <w:lang w:eastAsia="fr-FR"/>
+        </w:rPr>
+        <w:t>0</w:t>
+      </w:r>
+      <w:r>
+        <w:rPr>
+          <w:rFonts w:ascii="Consolas" w:eastAsia="Times New Roman" w:hAnsi="Consolas" w:cs="Times New Roman"/>
+          <w:color w:val="BBBEBF"/>
+          <w:sz w:val="21"/>
+          <w:szCs w:val="21"/>
+          <w:lang w:eastAsia="fr-FR"/>
+        </w:rPr>
+        <w:t>:</w:t>
+      </w:r>
+      <w:proofErr w:type="gramEnd"/>
+      <w:r>
+        <w:rPr>
+          <w:rFonts w:ascii="Consolas" w:eastAsia="Times New Roman" w:hAnsi="Consolas" w:cs="Times New Roman"/>
+          <w:color w:val="BBBEBF"/>
+          <w:sz w:val="21"/>
+          <w:szCs w:val="21"/>
+          <w:lang w:eastAsia="fr-FR"/>
+        </w:rPr>
+        <w:t xml:space="preserve"> </w:t>
+      </w:r>
+      <w:proofErr w:type="spellStart"/>
+      <w:r>
+        <w:rPr>
+          <w:rFonts w:ascii="Consolas" w:eastAsia="Times New Roman" w:hAnsi="Consolas" w:cs="Times New Roman"/>
+          <w:color w:val="4EC9B0"/>
+          <w:sz w:val="21"/>
+          <w:szCs w:val="21"/>
+          <w:lang w:eastAsia="fr-FR"/>
+        </w:rPr>
+        <w:t>str</w:t>
+      </w:r>
+      <w:proofErr w:type="spellEnd"/>
+      <w:r>
+        <w:rPr>
+          <w:rFonts w:ascii="Consolas" w:eastAsia="Times New Roman" w:hAnsi="Consolas" w:cs="Times New Roman"/>
+          <w:color w:val="BBBEBF"/>
+          <w:sz w:val="21"/>
+          <w:szCs w:val="21"/>
+          <w:lang w:eastAsia="fr-FR"/>
+        </w:rPr>
+        <w:t xml:space="preserve"> </w:t>
+      </w:r>
+      <w:r>
+        <w:rPr>
+          <w:rFonts w:ascii="Consolas" w:eastAsia="Times New Roman" w:hAnsi="Consolas" w:cs="Times New Roman"/>
+          <w:color w:val="D4D4D4"/>
+          <w:sz w:val="21"/>
+          <w:szCs w:val="21"/>
+          <w:lang w:eastAsia="fr-FR"/>
+        </w:rPr>
+        <w:t>=</w:t>
+      </w:r>
+      <w:r>
+        <w:rPr>
+          <w:rFonts w:ascii="Consolas" w:eastAsia="Times New Roman" w:hAnsi="Consolas" w:cs="Times New Roman"/>
+          <w:color w:val="BBBEBF"/>
+          <w:sz w:val="21"/>
+          <w:szCs w:val="21"/>
+          <w:lang w:eastAsia="fr-FR"/>
+        </w:rPr>
+        <w:t xml:space="preserve"> </w:t>
+      </w:r>
+      <w:r>
+        <w:rPr>
+          <w:rFonts w:ascii="Consolas" w:eastAsia="Times New Roman" w:hAnsi="Consolas" w:cs="Times New Roman"/>
+          <w:color w:val="A5D6FF"/>
+          <w:sz w:val="21"/>
+          <w:szCs w:val="21"/>
+          <w:lang w:eastAsia="fr-FR"/>
+        </w:rPr>
+        <w:t>"1 7"</w:t>
+      </w:r>
+      <w:r>
+        <w:rPr>
+          <w:rFonts w:ascii="Consolas" w:eastAsia="Times New Roman" w:hAnsi="Consolas" w:cs="Times New Roman"/>
+          <w:color w:val="BBBEBF"/>
+          <w:sz w:val="21"/>
+          <w:szCs w:val="21"/>
+          <w:lang w:eastAsia="fr-FR"/>
+        </w:rPr>
+        <w:t xml:space="preserve">       </w:t>
+      </w:r>
+      <w:r>
+        <w:rPr>
+          <w:rFonts w:ascii="Consolas" w:eastAsia="Times New Roman" w:hAnsi="Consolas" w:cs="Times New Roman"/>
+          <w:color w:val="8B949E"/>
+          <w:sz w:val="21"/>
+          <w:szCs w:val="21"/>
+          <w:lang w:eastAsia="fr-FR"/>
+        </w:rPr>
+        <w:t># non-semi-</w:t>
+      </w:r>
+      <w:proofErr w:type="spellStart"/>
+      <w:r>
+        <w:rPr>
+          <w:rFonts w:ascii="Consolas" w:eastAsia="Times New Roman" w:hAnsi="Consolas" w:cs="Times New Roman"/>
+          <w:color w:val="8B949E"/>
+          <w:sz w:val="21"/>
+          <w:szCs w:val="21"/>
+          <w:lang w:eastAsia="fr-FR"/>
+        </w:rPr>
+        <w:t>natural</w:t>
+      </w:r>
+      <w:proofErr w:type="spellEnd"/>
+      <w:r>
+        <w:rPr>
+          <w:rFonts w:ascii="Consolas" w:eastAsia="Times New Roman" w:hAnsi="Consolas" w:cs="Times New Roman"/>
+          <w:color w:val="8B949E"/>
+          <w:sz w:val="21"/>
+          <w:szCs w:val="21"/>
+          <w:lang w:eastAsia="fr-FR"/>
+        </w:rPr>
+        <w:t xml:space="preserve"> = 0</w:t>
+      </w:r>
+    </w:p>
+    <w:p>
+      <w:pPr>
+        <w:shd w:val="clear" w:color="auto" w:fill="121314"/>
+        <w:spacing w:line="285" w:lineRule="atLeast"/>
+        <w:rPr>
+          <w:rFonts w:ascii="Consolas" w:eastAsia="Times New Roman" w:hAnsi="Consolas" w:cs="Times New Roman"/>
+          <w:color w:val="BBBEBF"/>
+          <w:sz w:val="21"/>
+          <w:szCs w:val="21"/>
+          <w:lang w:eastAsia="fr-FR"/>
+        </w:rPr>
+      </w:pPr>
+      <w:r>
+        <w:rPr>
+          <w:rFonts w:ascii="Consolas" w:eastAsia="Times New Roman" w:hAnsi="Consolas" w:cs="Times New Roman"/>
+          <w:color w:val="79C0FF"/>
+          <w:sz w:val="21"/>
+          <w:szCs w:val="21"/>
+          <w:lang w:eastAsia="fr-FR"/>
+        </w:rPr>
+        <w:t>CLASSES_NULL</w:t>
+      </w:r>
+      <w:r>
+        <w:rPr>
+          <w:rFonts w:ascii="Consolas" w:eastAsia="Times New Roman" w:hAnsi="Consolas" w:cs="Times New Roman"/>
+          <w:color w:val="BBBEBF"/>
+          <w:sz w:val="21"/>
+          <w:szCs w:val="21"/>
+          <w:lang w:eastAsia="fr-FR"/>
+        </w:rPr>
+        <w:t xml:space="preserve">: </w:t>
+      </w:r>
+      <w:proofErr w:type="spellStart"/>
+      <w:r>
+        <w:rPr>
+          <w:rFonts w:ascii="Consolas" w:eastAsia="Times New Roman" w:hAnsi="Consolas" w:cs="Times New Roman"/>
+          <w:color w:val="4EC9B0"/>
+          <w:sz w:val="21"/>
+          <w:szCs w:val="21"/>
+          <w:lang w:eastAsia="fr-FR"/>
+        </w:rPr>
+        <w:t>str</w:t>
+      </w:r>
+      <w:proofErr w:type="spellEnd"/>
+      <w:r>
+        <w:rPr>
+          <w:rFonts w:ascii="Consolas" w:eastAsia="Times New Roman" w:hAnsi="Consolas" w:cs="Times New Roman"/>
+          <w:color w:val="BBBEBF"/>
+          <w:sz w:val="21"/>
+          <w:szCs w:val="21"/>
+          <w:lang w:eastAsia="fr-FR"/>
+        </w:rPr>
+        <w:t xml:space="preserve"> </w:t>
+      </w:r>
+      <w:r>
+        <w:rPr>
+          <w:rFonts w:ascii="Consolas" w:eastAsia="Times New Roman" w:hAnsi="Consolas" w:cs="Times New Roman"/>
+          <w:color w:val="D4D4D4"/>
+          <w:sz w:val="21"/>
+          <w:szCs w:val="21"/>
+          <w:lang w:eastAsia="fr-FR"/>
+        </w:rPr>
+        <w:t>=</w:t>
+      </w:r>
+      <w:r>
+        <w:rPr>
+          <w:rFonts w:ascii="Consolas" w:eastAsia="Times New Roman" w:hAnsi="Consolas" w:cs="Times New Roman"/>
+          <w:color w:val="BBBEBF"/>
+          <w:sz w:val="21"/>
+          <w:szCs w:val="21"/>
+          <w:lang w:eastAsia="fr-FR"/>
+        </w:rPr>
+        <w:t xml:space="preserve"> </w:t>
+      </w:r>
+      <w:r>
+        <w:rPr>
+          <w:rFonts w:ascii="Consolas" w:eastAsia="Times New Roman" w:hAnsi="Consolas" w:cs="Times New Roman"/>
+          <w:color w:val="A5D6FF"/>
+          <w:sz w:val="21"/>
+          <w:szCs w:val="21"/>
+          <w:lang w:eastAsia="fr-FR"/>
+        </w:rPr>
+        <w:t>"9 10 11"</w:t>
+      </w:r>
+      <w:r>
+        <w:rPr>
+          <w:rFonts w:ascii="Consolas" w:eastAsia="Times New Roman" w:hAnsi="Consolas" w:cs="Times New Roman"/>
+          <w:color w:val="BBBEBF"/>
+          <w:sz w:val="21"/>
+          <w:szCs w:val="21"/>
+          <w:lang w:eastAsia="fr-FR"/>
+        </w:rPr>
+        <w:t xml:space="preserve">                             </w:t>
+      </w:r>
+      <w:r>
+        <w:rPr>
+          <w:rFonts w:ascii="Consolas" w:eastAsia="Times New Roman" w:hAnsi="Consolas" w:cs="Times New Roman"/>
+          <w:color w:val="8B949E"/>
+          <w:sz w:val="21"/>
+          <w:szCs w:val="21"/>
+          <w:lang w:eastAsia="fr-FR"/>
+        </w:rPr>
+        <w:t xml:space="preserve"># </w:t>
+      </w:r>
+      <w:proofErr w:type="spellStart"/>
+      <w:r>
+        <w:rPr>
+          <w:rFonts w:ascii="Consolas" w:eastAsia="Times New Roman" w:hAnsi="Consolas" w:cs="Times New Roman"/>
+          <w:color w:val="8B949E"/>
+          <w:sz w:val="21"/>
+          <w:szCs w:val="21"/>
+          <w:lang w:eastAsia="fr-FR"/>
+        </w:rPr>
+        <w:t>ignored</w:t>
+      </w:r>
+      <w:proofErr w:type="spellEnd"/>
+      <w:r>
+        <w:rPr>
+          <w:rFonts w:ascii="Consolas" w:eastAsia="Times New Roman" w:hAnsi="Consolas" w:cs="Times New Roman"/>
+          <w:color w:val="8B949E"/>
+          <w:sz w:val="21"/>
+          <w:szCs w:val="21"/>
+          <w:lang w:eastAsia="fr-FR"/>
+        </w:rPr>
+        <w:t xml:space="preserve"> = NaN</w:t>
+      </w:r>
+      <w:bookmarkStart w:id="0" w:name="_GoBack"/>
+      <w:bookmarkEnd w:id="0"/>
+    </w:p>
+    <w:p/>
+    <w:p>
+      <w:pPr>
+        <w:pStyle w:val="Titre2"/>
+      </w:pPr>
+      <w:r>
+        <w:t>Output</w:t>
+      </w:r>
+    </w:p>
+    <w:p>
+      <w:r>
+        <w:t>Les outputs attendus sont mis dans le dossier output.</w:t>
+      </w:r>
+    </w:p>
+    <w:p>
+      <w:r>
+        <w:t xml:space="preserve">Un fichier </w:t>
+      </w:r>
+      <w:proofErr w:type="spellStart"/>
+      <w:r>
+        <w:t>qml</w:t>
+      </w:r>
+      <w:proofErr w:type="spellEnd"/>
+      <w:r>
+        <w:t xml:space="preserve"> </w:t>
+      </w:r>
+      <w:r>
+        <w:t xml:space="preserve">y </w:t>
+      </w:r>
+      <w:r>
+        <w:t>est fourni pour offrir un exemple de style de représentation des valeurs d’intégrité.</w:t>
+      </w:r>
+    </w:p>
+    <w:p/>
+    <w:p>
+      <w:pPr>
+        <w:pStyle w:val="Titre1"/>
+      </w:pPr>
+      <w:r>
+        <w:t xml:space="preserve">Déroulé du test </w:t>
+      </w:r>
+      <w:r>
+        <w:t xml:space="preserve">2 – </w:t>
+      </w:r>
+      <w:proofErr w:type="spellStart"/>
+      <w:r>
+        <w:t>Intersection_vectors</w:t>
+      </w:r>
+      <w:proofErr w:type="spellEnd"/>
+      <w:r>
+        <w:t xml:space="preserve"> + </w:t>
+      </w:r>
+      <w:proofErr w:type="spellStart"/>
+      <w:r>
+        <w:t>Integrity_vector</w:t>
+      </w:r>
+      <w:proofErr w:type="spellEnd"/>
+    </w:p>
+    <w:p>
+      <w:pPr>
+        <w:pStyle w:val="Titre2"/>
+      </w:pPr>
+      <w:r>
+        <w:t xml:space="preserve">Document du </w:t>
+      </w:r>
+      <w:r>
+        <w:t>dossier</w:t>
+      </w:r>
+      <w:r>
+        <w:t xml:space="preserve"> pour ce test</w:t>
+      </w:r>
     </w:p>
     <w:p>
       <w:pPr>
@@ -256,6 +1435,287 @@
           <w:ilvl w:val="0"/>
           <w:numId w:val="2"/>
         </w:numPr>
+        <w:rPr>
+          <w:lang w:val="en-GB"/>
+        </w:rPr>
+      </w:pPr>
+      <w:proofErr w:type="spellStart"/>
+      <w:r>
+        <w:rPr>
+          <w:lang w:val="en-GB"/>
+        </w:rPr>
+        <w:t>Primary_</w:t>
+      </w:r>
+      <w:r>
+        <w:rPr>
+          <w:lang w:val="en-GB"/>
+        </w:rPr>
+        <w:t>vector_</w:t>
+      </w:r>
+      <w:r>
+        <w:rPr>
+          <w:lang w:val="en-GB"/>
+        </w:rPr>
+        <w:t>layer_</w:t>
+      </w:r>
+      <w:proofErr w:type="gramStart"/>
+      <w:r>
+        <w:rPr>
+          <w:lang w:val="en-GB"/>
+        </w:rPr>
+        <w:t>COSIA.gpkg</w:t>
+      </w:r>
+      <w:proofErr w:type="spellEnd"/>
+      <w:r>
+        <w:rPr>
+          <w:lang w:val="en-GB"/>
+        </w:rPr>
+        <w:t> :</w:t>
+      </w:r>
+      <w:proofErr w:type="gramEnd"/>
+      <w:r>
+        <w:rPr>
+          <w:lang w:val="en-GB"/>
+        </w:rPr>
+        <w:t xml:space="preserve"> </w:t>
+      </w:r>
+      <w:r>
+        <w:rPr>
+          <w:lang w:val="en-GB"/>
+        </w:rPr>
+        <w:t>champ</w:t>
+      </w:r>
+      <w:r>
+        <w:rPr>
+          <w:lang w:val="en-GB"/>
+        </w:rPr>
+        <w:t xml:space="preserve"> </w:t>
+      </w:r>
+      <w:r>
+        <w:rPr>
+          <w:lang w:val="en-GB"/>
+        </w:rPr>
+        <w:t xml:space="preserve">analyse </w:t>
+      </w:r>
+      <w:r>
+        <w:rPr>
+          <w:lang w:val="en-GB"/>
+        </w:rPr>
+        <w:t>“</w:t>
+      </w:r>
+      <w:proofErr w:type="spellStart"/>
+      <w:r>
+        <w:rPr>
+          <w:lang w:val="en-GB"/>
+        </w:rPr>
+        <w:t>numero</w:t>
+      </w:r>
+      <w:proofErr w:type="spellEnd"/>
+      <w:r>
+        <w:rPr>
+          <w:lang w:val="en-GB"/>
+        </w:rPr>
+        <w:t>”</w:t>
+      </w:r>
+    </w:p>
+    <w:p>
+      <w:pPr>
+        <w:pStyle w:val="Paragraphedeliste"/>
+        <w:numPr>
+          <w:ilvl w:val="0"/>
+          <w:numId w:val="2"/>
+        </w:numPr>
+        <w:rPr>
+          <w:lang w:val="en-GB"/>
+        </w:rPr>
+      </w:pPr>
+      <w:proofErr w:type="spellStart"/>
+      <w:r>
+        <w:rPr>
+          <w:lang w:val="en-GB"/>
+        </w:rPr>
+        <w:t>Secondary_</w:t>
+      </w:r>
+      <w:r>
+        <w:rPr>
+          <w:lang w:val="en-GB"/>
+        </w:rPr>
+        <w:t>vector_</w:t>
+      </w:r>
+      <w:r>
+        <w:rPr>
+          <w:lang w:val="en-GB"/>
+        </w:rPr>
+        <w:t>layer_</w:t>
+      </w:r>
+      <w:proofErr w:type="gramStart"/>
+      <w:r>
+        <w:rPr>
+          <w:lang w:val="en-GB"/>
+        </w:rPr>
+        <w:t>CarHab.gpkg</w:t>
+      </w:r>
+      <w:proofErr w:type="spellEnd"/>
+      <w:r>
+        <w:rPr>
+          <w:lang w:val="en-GB"/>
+        </w:rPr>
+        <w:t> :</w:t>
+      </w:r>
+      <w:proofErr w:type="gramEnd"/>
+      <w:r>
+        <w:rPr>
+          <w:lang w:val="en-GB"/>
+        </w:rPr>
+        <w:t xml:space="preserve"> </w:t>
+      </w:r>
+      <w:r>
+        <w:rPr>
+          <w:lang w:val="en-GB"/>
+        </w:rPr>
+        <w:t xml:space="preserve">champ </w:t>
+      </w:r>
+      <w:proofErr w:type="spellStart"/>
+      <w:r>
+        <w:rPr>
+          <w:lang w:val="en-GB"/>
+        </w:rPr>
+        <w:t>analysé</w:t>
+      </w:r>
+      <w:proofErr w:type="spellEnd"/>
+      <w:r>
+        <w:rPr>
+          <w:lang w:val="en-GB"/>
+        </w:rPr>
+        <w:t xml:space="preserve"> “</w:t>
+      </w:r>
+      <w:proofErr w:type="spellStart"/>
+      <w:r>
+        <w:rPr>
+          <w:lang w:val="en-GB"/>
+        </w:rPr>
+        <w:t>code_physio</w:t>
+      </w:r>
+      <w:proofErr w:type="spellEnd"/>
+      <w:r>
+        <w:rPr>
+          <w:lang w:val="en-GB"/>
+        </w:rPr>
+        <w:t>”</w:t>
+      </w:r>
+    </w:p>
+    <w:p>
+      <w:pPr>
+        <w:pStyle w:val="Paragraphedeliste"/>
+        <w:numPr>
+          <w:ilvl w:val="0"/>
+          <w:numId w:val="2"/>
+        </w:numPr>
+      </w:pPr>
+      <w:proofErr w:type="spellStart"/>
+      <w:r>
+        <w:lastRenderedPageBreak/>
+        <w:t>Primary_layer_COSIA.qml</w:t>
+      </w:r>
+      <w:proofErr w:type="spellEnd"/>
+      <w:r>
+        <w:t> : fichier de style pour</w:t>
+      </w:r>
+      <w:r>
+        <w:t xml:space="preserve"> représenter la légende fournie dans la notice de la couche </w:t>
+      </w:r>
+      <w:proofErr w:type="spellStart"/>
+      <w:r>
+        <w:t>numero</w:t>
+      </w:r>
+      <w:proofErr w:type="spellEnd"/>
+    </w:p>
+    <w:p>
+      <w:pPr>
+        <w:pStyle w:val="Paragraphedeliste"/>
+        <w:numPr>
+          <w:ilvl w:val="0"/>
+          <w:numId w:val="2"/>
+        </w:numPr>
+      </w:pPr>
+      <w:proofErr w:type="spellStart"/>
+      <w:r>
+        <w:t>Secondary_layer_CarHab</w:t>
+      </w:r>
+      <w:r>
+        <w:t>.qml</w:t>
+      </w:r>
+      <w:proofErr w:type="spellEnd"/>
+      <w:r>
+        <w:t xml:space="preserve"> : </w:t>
+      </w:r>
+      <w:r>
+        <w:t>fichier de style pour</w:t>
+      </w:r>
+      <w:r>
+        <w:t xml:space="preserve"> représenter la légende fournie dans la notice de la couche </w:t>
+      </w:r>
+      <w:proofErr w:type="spellStart"/>
+      <w:r>
+        <w:t>code_physio</w:t>
+      </w:r>
+      <w:proofErr w:type="spellEnd"/>
+    </w:p>
+    <w:p>
+      <w:pPr>
+        <w:pStyle w:val="Paragraphedeliste"/>
+        <w:numPr>
+          <w:ilvl w:val="0"/>
+          <w:numId w:val="2"/>
+        </w:numPr>
+      </w:pPr>
+      <w:r>
+        <w:t>Cosia_Documentation_Technique_IGN_2023</w:t>
+      </w:r>
+      <w:r>
+        <w:t xml:space="preserve">.pdf : </w:t>
+      </w:r>
+      <w:r>
+        <w:t xml:space="preserve">pour avoir accès aux classifications de couverture des sols inclues dans la couche </w:t>
+      </w:r>
+      <w:r>
+        <w:t xml:space="preserve">primaire </w:t>
+      </w:r>
+      <w:r>
+        <w:t>à analyser</w:t>
+      </w:r>
+    </w:p>
+    <w:p>
+      <w:pPr>
+        <w:pStyle w:val="Paragraphedeliste"/>
+        <w:numPr>
+          <w:ilvl w:val="0"/>
+          <w:numId w:val="2"/>
+        </w:numPr>
+      </w:pPr>
+      <w:r>
+        <w:t>CarHab_42_Loire_Notice</w:t>
+      </w:r>
+      <w:r>
+        <w:t xml:space="preserve">.pdf </w:t>
+      </w:r>
+      <w:r>
+        <w:t xml:space="preserve">: pour avoir accès aux classifications de couverture des sols inclues dans la couche </w:t>
+      </w:r>
+      <w:r>
+        <w:t>secondaire</w:t>
+      </w:r>
+      <w:r>
+        <w:t xml:space="preserve"> à analyser</w:t>
+      </w:r>
+    </w:p>
+    <w:p>
+      <w:pPr>
+        <w:pStyle w:val="Paragraphedeliste"/>
+        <w:numPr>
+          <w:ilvl w:val="0"/>
+          <w:numId w:val="2"/>
+        </w:numPr>
       </w:pPr>
       <w:r>
         <w:t>Emprise.gpkg : zone sur laquelle faire le calcul d’intégrité</w:t>
@@ -1151,7 +2611,6 @@
         <w:pStyle w:val="Titre2"/>
       </w:pPr>
       <w:r>
-        <w:lastRenderedPageBreak/>
         <w:t xml:space="preserve">Calcul de l’intégrité fonctionnelle de la biosphère – </w:t>
       </w:r>
       <w:proofErr w:type="spellStart"/>
@@ -1526,6 +2985,7 @@
                 <w:rFonts w:ascii="Calibri" w:hAnsi="Calibri" w:cs="Calibri"/>
                 <w:color w:val="000000"/>
               </w:rPr>
+              <w:lastRenderedPageBreak/>
               <w:t>7</w:t>
             </w:r>
           </w:p>
@@ -2560,10 +4020,7 @@
     </w:p>
     <w:p>
       <w:r>
-        <w:t>Les outputs attendus sont mis dans le dossier output</w:t>
-      </w:r>
-      <w:r>
-        <w:t>.</w:t>
+        <w:t>Les outputs attendus sont mis dans le dossier output.</w:t>
       </w:r>
     </w:p>
     <w:p>
@@ -2576,7 +4033,16 @@
       </w:r>
       <w:proofErr w:type="spellEnd"/>
       <w:r>
-        <w:t xml:space="preserve"> est fournit </w:t>
+        <w:t xml:space="preserve"> y</w:t>
+      </w:r>
+      <w:r>
+        <w:t xml:space="preserve"> est </w:t>
+      </w:r>
+      <w:r>
+        <w:t>fourni</w:t>
+      </w:r>
+      <w:r>
+        <w:t xml:space="preserve"> </w:t>
       </w:r>
       <w:r>
         <w:t>pour offrir un exemple de style de</w:t>
@@ -2587,8 +4053,6 @@
       <w:r>
         <w:t>ation des</w:t>
       </w:r>
-      <w:bookmarkStart w:id="0" w:name="_GoBack"/>
-      <w:bookmarkEnd w:id="0"/>
       <w:r>
         <w:t xml:space="preserve"> valeurs d’intégrité</w:t>
       </w:r>
@@ -2596,6 +4060,8 @@
         <w:t>.</w:t>
       </w:r>
     </w:p>
+    <w:p/>
+    <w:p/>
     <w:sectPr>
       <w:pgSz w:w="11906" w:h="16838"/>
       <w:pgMar w:top="1417" w:right="1417" w:bottom="1417" w:left="1417" w:header="708" w:footer="708" w:gutter="0"/>
@@ -3238,7 +4704,7 @@
   <w:style w:type="paragraph" w:default="1" w:styleId="Normal">
     <w:name w:val="Normal"/>
     <w:qFormat/>
-    <w:rsid w:val="001C59B1"/>
+    <w:rsid w:val="00304E98"/>
   </w:style>
   <w:style w:type="paragraph" w:styleId="Titre1">
     <w:name w:val="heading 1"/>

</xml_diff>